<commit_message>
Learn an associated an Elastic IP to an EC2 instance
</commit_message>
<xml_diff>
--- a/5. EC2 11-02-2026/DAY-5.docx
+++ b/5. EC2 11-02-2026/DAY-5.docx
@@ -13,6 +13,12 @@
         <w:rPr>
           <w:lang w:val="en-US"/>
         </w:rPr>
+        <w:t xml:space="preserve"> </w:t>
+      </w:r>
+      <w:r>
+        <w:rPr>
+          <w:lang w:val="en-US"/>
+        </w:rPr>
         <w:t>DAY-5                                               EC2</w:t>
       </w:r>
     </w:p>
@@ -59,7 +65,21 @@
         <w:rPr>
           <w:lang w:val="en-US"/>
         </w:rPr>
-        <w:t>Create a Windows Vm using Microsoft Windows AMI</w:t>
+        <w:t xml:space="preserve">Create a Windows </w:t>
+      </w:r>
+      <w:proofErr w:type="spellStart"/>
+      <w:r>
+        <w:rPr>
+          <w:lang w:val="en-US"/>
+        </w:rPr>
+        <w:t>Vm</w:t>
+      </w:r>
+      <w:proofErr w:type="spellEnd"/>
+      <w:r>
+        <w:rPr>
+          <w:lang w:val="en-US"/>
+        </w:rPr>
+        <w:t xml:space="preserve"> using Microsoft Windows AMI</w:t>
       </w:r>
     </w:p>
     <w:p>
@@ -85,7 +105,21 @@
         <w:rPr>
           <w:lang w:val="en-US"/>
         </w:rPr>
-        <w:t>Connect with the Vm to our windows machine with RDP protocol.</w:t>
+        <w:t xml:space="preserve">Connect with the </w:t>
+      </w:r>
+      <w:proofErr w:type="spellStart"/>
+      <w:r>
+        <w:rPr>
+          <w:lang w:val="en-US"/>
+        </w:rPr>
+        <w:t>Vm</w:t>
+      </w:r>
+      <w:proofErr w:type="spellEnd"/>
+      <w:r>
+        <w:rPr>
+          <w:lang w:val="en-US"/>
+        </w:rPr>
+        <w:t xml:space="preserve"> to our windows machine with RDP protocol.</w:t>
       </w:r>
     </w:p>
     <w:p>
@@ -1007,7 +1041,21 @@
         <w:rPr>
           <w:lang w:val="en-US"/>
         </w:rPr>
-        <w:t xml:space="preserve">Scroll down you an see the </w:t>
+        <w:t xml:space="preserve">Scroll down you </w:t>
+      </w:r>
+      <w:proofErr w:type="spellStart"/>
+      <w:r>
+        <w:rPr>
+          <w:lang w:val="en-US"/>
+        </w:rPr>
+        <w:t>an</w:t>
+      </w:r>
+      <w:proofErr w:type="spellEnd"/>
+      <w:r>
+        <w:rPr>
+          <w:lang w:val="en-US"/>
+        </w:rPr>
+        <w:t xml:space="preserve"> see the </w:t>
       </w:r>
       <w:r>
         <w:rPr>
@@ -1035,7 +1083,21 @@
         <w:rPr>
           <w:lang w:val="en-US"/>
         </w:rPr>
-        <w:t>which are noting but the Computer name and Username for the RDC connection.</w:t>
+        <w:t xml:space="preserve">which are noting but the </w:t>
+      </w:r>
+      <w:proofErr w:type="gramStart"/>
+      <w:r>
+        <w:rPr>
+          <w:lang w:val="en-US"/>
+        </w:rPr>
+        <w:t>Computer</w:t>
+      </w:r>
+      <w:proofErr w:type="gramEnd"/>
+      <w:r>
+        <w:rPr>
+          <w:lang w:val="en-US"/>
+        </w:rPr>
+        <w:t xml:space="preserve"> name and Username for the RDC connection.</w:t>
       </w:r>
     </w:p>
     <w:p>
@@ -1171,8 +1233,30 @@
         <w:rPr>
           <w:lang w:val="en-US"/>
         </w:rPr>
-        <w:t>.pem file .</w:t>
-      </w:r>
+        <w:t>.</w:t>
+      </w:r>
+      <w:proofErr w:type="spellStart"/>
+      <w:r>
+        <w:rPr>
+          <w:lang w:val="en-US"/>
+        </w:rPr>
+        <w:t>pem</w:t>
+      </w:r>
+      <w:proofErr w:type="spellEnd"/>
+      <w:r>
+        <w:rPr>
+          <w:lang w:val="en-US"/>
+        </w:rPr>
+        <w:t xml:space="preserve"> </w:t>
+      </w:r>
+      <w:proofErr w:type="gramStart"/>
+      <w:r>
+        <w:rPr>
+          <w:lang w:val="en-US"/>
+        </w:rPr>
+        <w:t>file .</w:t>
+      </w:r>
+      <w:proofErr w:type="gramEnd"/>
     </w:p>
     <w:p>
       <w:pPr>
@@ -1186,7 +1270,7 @@
           <w:lang w:val="en-US"/>
         </w:rPr>
         <w:drawing>
-          <wp:inline distT="0" distB="0" distL="0" distR="0" wp14:anchorId="4626CBD9" wp14:editId="0251A6C8">
+          <wp:inline distT="0" distB="0" distL="0" distR="0" wp14:anchorId="4626CBD9" wp14:editId="181B919A">
             <wp:extent cx="6645910" cy="3142615"/>
             <wp:effectExtent l="0" t="0" r="2540" b="635"/>
             <wp:docPr id="1616076408" name="Picture 4"/>
@@ -1258,7 +1342,7 @@
           <w:lang w:val="en-US"/>
         </w:rPr>
         <w:drawing>
-          <wp:inline distT="0" distB="0" distL="0" distR="0" wp14:anchorId="5BD478F7" wp14:editId="3ADE6EE9">
+          <wp:inline distT="0" distB="0" distL="0" distR="0" wp14:anchorId="5BD478F7" wp14:editId="08B1627A">
             <wp:extent cx="6645910" cy="3141345"/>
             <wp:effectExtent l="0" t="0" r="2540" b="1905"/>
             <wp:docPr id="2140305933" name="Picture 5"/>
@@ -1495,7 +1579,35 @@
           <w:lang w:val="en-US"/>
         </w:rPr>
         <w:lastRenderedPageBreak/>
-        <w:t>It will ask for password which is noting but the password we get after decrypting the .pem file copy form the EC2 console and paste it here.</w:t>
+        <w:t xml:space="preserve">It will ask for password which is </w:t>
+      </w:r>
+      <w:proofErr w:type="spellStart"/>
+      <w:r>
+        <w:rPr>
+          <w:lang w:val="en-US"/>
+        </w:rPr>
+        <w:t>noting</w:t>
+      </w:r>
+      <w:proofErr w:type="spellEnd"/>
+      <w:r>
+        <w:rPr>
+          <w:lang w:val="en-US"/>
+        </w:rPr>
+        <w:t xml:space="preserve"> but the password we get after decrypting the .</w:t>
+      </w:r>
+      <w:proofErr w:type="spellStart"/>
+      <w:r>
+        <w:rPr>
+          <w:lang w:val="en-US"/>
+        </w:rPr>
+        <w:t>pem</w:t>
+      </w:r>
+      <w:proofErr w:type="spellEnd"/>
+      <w:r>
+        <w:rPr>
+          <w:lang w:val="en-US"/>
+        </w:rPr>
+        <w:t xml:space="preserve"> file copy form the EC2 console and paste it here.</w:t>
       </w:r>
     </w:p>
     <w:p>
@@ -1669,7 +1781,7 @@
           <w:lang w:val="en-US"/>
         </w:rPr>
         <w:drawing>
-          <wp:inline distT="0" distB="0" distL="0" distR="0" wp14:anchorId="3763C668" wp14:editId="14DB4478">
+          <wp:inline distT="0" distB="0" distL="0" distR="0" wp14:anchorId="3763C668" wp14:editId="5C7B7E84">
             <wp:extent cx="6645910" cy="3707765"/>
             <wp:effectExtent l="0" t="0" r="2540" b="6985"/>
             <wp:docPr id="581157432" name="Picture 7"/>

</xml_diff>